<commit_message>
Windows akış diyagramından yeniden başlatma adımını kaldır, PDF ekle
Windows bilgisayar adı değiştirme akışı 4 yerine 3 adıma indirildi
(restart adımı çıkarıldı). Ayrıca dokümanın PDF çıktısı eklendi.
</commit_message>
<xml_diff>
--- a/docs/Bilgisayar-Adi-Degistirme-Rehberi.docx
+++ b/docs/Bilgisayar-Adi-Degistirme-Rehberi.docx
@@ -145,7 +145,7 @@
       <w:r>
         <w:drawing>
           <wp:inline distT="0" distB="0" distL="0" distR="0">
-            <wp:extent cx="5905500" cy="1695450"/>
+            <wp:extent cx="5143500" cy="1695450"/>
             <wp:effectExtent t="0" r="0" b="0" l="0"/>
             <wp:docPr id="1" name="" descr="" title=""/>
             <wp:cNvGraphicFramePr>
@@ -170,7 +170,7 @@
                   <pic:spPr bwMode="auto">
                     <a:xfrm>
                       <a:off x="0" y="0"/>
-                      <a:ext cx="5905500" cy="1695450"/>
+                      <a:ext cx="5143500" cy="1695450"/>
                     </a:xfrm>
                     <a:prstGeom prst="rect">
                       <a:avLst/>

</xml_diff>

<commit_message>
"Bu doküman ne işe yarar" ve "Sık karşılaşılan sorunlar" bölümlerini kaldır
Kullanıcı isteği üzerine giriş bilgi kutusu ve sorun giderme
tablosu dokümandan çıkarıldı.
</commit_message>
<xml_diff>
--- a/docs/Bilgisayar-Adi-Degistirme-Rehberi.docx
+++ b/docs/Bilgisayar-Adi-Degistirme-Rehberi.docx
@@ -49,71 +49,6 @@
         </w:rPr>
         <w:t xml:space="preserve">Adım adım kurumsal kullanım rehberi</w:t>
       </w:r>
-    </w:p>
-    <w:tbl>
-      <w:tblPr>
-        <w:tblW w:type="dxa" w:w="9360"/>
-        <w:tblBorders>
-          <w:top w:val="single" w:color="auto" w:sz="4"/>
-          <w:left w:val="single" w:color="auto" w:sz="4"/>
-          <w:bottom w:val="single" w:color="auto" w:sz="4"/>
-          <w:right w:val="single" w:color="auto" w:sz="4"/>
-          <w:insideH w:val="single" w:color="auto" w:sz="4"/>
-          <w:insideV w:val="single" w:color="auto" w:sz="4"/>
-        </w:tblBorders>
-      </w:tblPr>
-      <w:tblGrid>
-        <w:gridCol w:w="9360"/>
-      </w:tblGrid>
-      <w:tr>
-        <w:tc>
-          <w:tcPr>
-            <w:tcW w:type="dxa" w:w="9360"/>
-            <w:tcBorders>
-              <w:top w:val="single" w:color="0078D4" w:sz="4"/>
-              <w:left w:val="single" w:color="0078D4" w:sz="24"/>
-              <w:bottom w:val="single" w:color="0078D4" w:sz="4"/>
-              <w:right w:val="single" w:color="0078D4" w:sz="4"/>
-            </w:tcBorders>
-            <w:shd w:fill="F3F3F3" w:val="clear"/>
-            <w:tcMar>
-              <w:top w:type="dxa" w:w="160"/>
-              <w:left w:type="dxa" w:w="220"/>
-              <w:bottom w:type="dxa" w:w="160"/>
-              <w:right w:type="dxa" w:w="220"/>
-            </w:tcMar>
-          </w:tcPr>
-          <w:p>
-            <w:pPr>
-              <w:spacing w:after="60"/>
-            </w:pPr>
-            <w:r>
-              <w:rPr>
-                <w:b/>
-                <w:bCs/>
-                <w:color w:val="0078D4"/>
-                <w:sz w:val="22"/>
-                <w:szCs w:val="22"/>
-              </w:rPr>
-              <w:t xml:space="preserve">Bu Doküman Ne İşe Yarar?</w:t>
-            </w:r>
-          </w:p>
-          <w:p>
-            <w:r>
-              <w:rPr>
-                <w:sz w:val="21"/>
-                <w:szCs w:val="21"/>
-              </w:rPr>
-              <w:t xml:space="preserve">Windows ve macOS işletim sistemlerinde bilgisayarınızın ağ üzerinde görünen adını (hostname) nasıl değiştireceğinizi, hem grafik arayüz hem de komut satırı yöntemleriyle anlatır.</w:t>
-            </w:r>
-          </w:p>
-        </w:tc>
-      </w:tr>
-    </w:tbl>
-    <w:p>
-      <w:pPr>
-        <w:spacing w:after="300"/>
-      </w:pPr>
     </w:p>
     <w:p>
       <w:pPr>
@@ -1135,321 +1070,6 @@
         <w:t xml:space="preserve">Yeniden başlatma sonrası ad kalıcı olarak korunuyor</w:t>
       </w:r>
     </w:p>
-    <w:p>
-      <w:pPr>
-        <w:spacing w:after="300"/>
-      </w:pPr>
-    </w:p>
-    <w:p>
-      <w:pPr>
-        <w:pStyle w:val="Heading1"/>
-        <w:spacing w:after="160" w:before="320"/>
-      </w:pPr>
-      <w:r>
-        <w:t xml:space="preserve">4. Sık Karşılaşılan Sorunlar</w:t>
-      </w:r>
-    </w:p>
-    <w:tbl>
-      <w:tblPr>
-        <w:tblW w:type="dxa" w:w="9360"/>
-        <w:tblBorders>
-          <w:top w:val="single" w:color="auto" w:sz="4"/>
-          <w:left w:val="single" w:color="auto" w:sz="4"/>
-          <w:bottom w:val="single" w:color="auto" w:sz="4"/>
-          <w:right w:val="single" w:color="auto" w:sz="4"/>
-          <w:insideH w:val="single" w:color="auto" w:sz="4"/>
-          <w:insideV w:val="single" w:color="auto" w:sz="4"/>
-        </w:tblBorders>
-      </w:tblPr>
-      <w:tblGrid>
-        <w:gridCol w:w="3120"/>
-        <w:gridCol w:w="3120"/>
-        <w:gridCol w:w="3120"/>
-      </w:tblGrid>
-      <w:tr>
-        <w:trPr>
-          <w:tblHeader/>
-        </w:trPr>
-        <w:tc>
-          <w:tcPr>
-            <w:tcW w:type="dxa" w:w="3120"/>
-            <w:shd w:fill="0078D4" w:val="clear"/>
-            <w:tcMar>
-              <w:top w:type="dxa" w:w="100"/>
-              <w:left w:type="dxa" w:w="120"/>
-              <w:bottom w:type="dxa" w:w="100"/>
-              <w:right w:type="dxa" w:w="120"/>
-            </w:tcMar>
-          </w:tcPr>
-          <w:p>
-            <w:r>
-              <w:rPr>
-                <w:b/>
-                <w:bCs/>
-                <w:color w:val="FFFFFF"/>
-              </w:rPr>
-              <w:t xml:space="preserve">Belirti</w:t>
-            </w:r>
-          </w:p>
-        </w:tc>
-        <w:tc>
-          <w:tcPr>
-            <w:tcW w:type="dxa" w:w="3120"/>
-            <w:shd w:fill="0078D4" w:val="clear"/>
-            <w:tcMar>
-              <w:top w:type="dxa" w:w="100"/>
-              <w:left w:type="dxa" w:w="120"/>
-              <w:bottom w:type="dxa" w:w="100"/>
-              <w:right w:type="dxa" w:w="120"/>
-            </w:tcMar>
-          </w:tcPr>
-          <w:p>
-            <w:r>
-              <w:rPr>
-                <w:b/>
-                <w:bCs/>
-                <w:color w:val="FFFFFF"/>
-              </w:rPr>
-              <w:t xml:space="preserve">Olası Neden</w:t>
-            </w:r>
-          </w:p>
-        </w:tc>
-        <w:tc>
-          <w:tcPr>
-            <w:tcW w:type="dxa" w:w="3120"/>
-            <w:shd w:fill="0078D4" w:val="clear"/>
-            <w:tcMar>
-              <w:top w:type="dxa" w:w="100"/>
-              <w:left w:type="dxa" w:w="120"/>
-              <w:bottom w:type="dxa" w:w="100"/>
-              <w:right w:type="dxa" w:w="120"/>
-            </w:tcMar>
-          </w:tcPr>
-          <w:p>
-            <w:r>
-              <w:rPr>
-                <w:b/>
-                <w:bCs/>
-                <w:color w:val="FFFFFF"/>
-              </w:rPr>
-              <w:t xml:space="preserve">Çözüm</w:t>
-            </w:r>
-          </w:p>
-        </w:tc>
-      </w:tr>
-      <w:tr>
-        <w:tc>
-          <w:tcPr>
-            <w:tcW w:type="dxa" w:w="3120"/>
-            <w:shd w:fill="FFFFFF" w:val="clear"/>
-            <w:tcMar>
-              <w:top w:type="dxa" w:w="90"/>
-              <w:left w:type="dxa" w:w="120"/>
-              <w:bottom w:type="dxa" w:w="90"/>
-              <w:right w:type="dxa" w:w="120"/>
-            </w:tcMar>
-          </w:tcPr>
-          <w:p>
-            <w:r>
-              <w:t xml:space="preserve">Windows'ta ad değişikliği kabul edilmiyor</w:t>
-            </w:r>
-          </w:p>
-        </w:tc>
-        <w:tc>
-          <w:tcPr>
-            <w:tcW w:type="dxa" w:w="3120"/>
-            <w:shd w:fill="FFFFFF" w:val="clear"/>
-            <w:tcMar>
-              <w:top w:type="dxa" w:w="90"/>
-              <w:left w:type="dxa" w:w="120"/>
-              <w:bottom w:type="dxa" w:w="90"/>
-              <w:right w:type="dxa" w:w="120"/>
-            </w:tcMar>
-          </w:tcPr>
-          <w:p>
-            <w:r>
-              <w:t xml:space="preserve">Domain politikası kısıtlıyor</w:t>
-            </w:r>
-          </w:p>
-        </w:tc>
-        <w:tc>
-          <w:tcPr>
-            <w:tcW w:type="dxa" w:w="3120"/>
-            <w:shd w:fill="FFFFFF" w:val="clear"/>
-            <w:tcMar>
-              <w:top w:type="dxa" w:w="90"/>
-              <w:left w:type="dxa" w:w="120"/>
-              <w:bottom w:type="dxa" w:w="90"/>
-              <w:right w:type="dxa" w:w="120"/>
-            </w:tcMar>
-          </w:tcPr>
-          <w:p>
-            <w:r>
-              <w:t xml:space="preserve">Domain yöneticisinden yetki isteyin</w:t>
-            </w:r>
-          </w:p>
-        </w:tc>
-      </w:tr>
-      <w:tr>
-        <w:tc>
-          <w:tcPr>
-            <w:tcW w:type="dxa" w:w="3120"/>
-            <w:shd w:fill="F7F7F7" w:val="clear"/>
-            <w:tcMar>
-              <w:top w:type="dxa" w:w="90"/>
-              <w:left w:type="dxa" w:w="120"/>
-              <w:bottom w:type="dxa" w:w="90"/>
-              <w:right w:type="dxa" w:w="120"/>
-            </w:tcMar>
-          </w:tcPr>
-          <w:p>
-            <w:r>
-              <w:t xml:space="preserve">Mac'te eski ad ağda görünmeye devam ediyor</w:t>
-            </w:r>
-          </w:p>
-        </w:tc>
-        <w:tc>
-          <w:tcPr>
-            <w:tcW w:type="dxa" w:w="3120"/>
-            <w:shd w:fill="F7F7F7" w:val="clear"/>
-            <w:tcMar>
-              <w:top w:type="dxa" w:w="90"/>
-              <w:left w:type="dxa" w:w="120"/>
-              <w:bottom w:type="dxa" w:w="90"/>
-              <w:right w:type="dxa" w:w="120"/>
-            </w:tcMar>
-          </w:tcPr>
-          <w:p>
-            <w:r>
-              <w:t xml:space="preserve">mDNSResponder önbelleği</w:t>
-            </w:r>
-          </w:p>
-        </w:tc>
-        <w:tc>
-          <w:tcPr>
-            <w:tcW w:type="dxa" w:w="3120"/>
-            <w:shd w:fill="F7F7F7" w:val="clear"/>
-            <w:tcMar>
-              <w:top w:type="dxa" w:w="90"/>
-              <w:left w:type="dxa" w:w="120"/>
-              <w:bottom w:type="dxa" w:w="90"/>
-              <w:right w:type="dxa" w:w="120"/>
-            </w:tcMar>
-          </w:tcPr>
-          <w:p>
-            <w:r>
-              <w:t xml:space="preserve">Bölüm 2.3'teki komutları çalıştırın</w:t>
-            </w:r>
-          </w:p>
-        </w:tc>
-      </w:tr>
-      <w:tr>
-        <w:tc>
-          <w:tcPr>
-            <w:tcW w:type="dxa" w:w="3120"/>
-            <w:shd w:fill="FFFFFF" w:val="clear"/>
-            <w:tcMar>
-              <w:top w:type="dxa" w:w="90"/>
-              <w:left w:type="dxa" w:w="120"/>
-              <w:bottom w:type="dxa" w:w="90"/>
-              <w:right w:type="dxa" w:w="120"/>
-            </w:tcMar>
-          </w:tcPr>
-          <w:p>
-            <w:r>
-              <w:t xml:space="preserve">Mac'te LocalHostName ayarlanamıyor</w:t>
-            </w:r>
-          </w:p>
-        </w:tc>
-        <w:tc>
-          <w:tcPr>
-            <w:tcW w:type="dxa" w:w="3120"/>
-            <w:shd w:fill="FFFFFF" w:val="clear"/>
-            <w:tcMar>
-              <w:top w:type="dxa" w:w="90"/>
-              <w:left w:type="dxa" w:w="120"/>
-              <w:bottom w:type="dxa" w:w="90"/>
-              <w:right w:type="dxa" w:w="120"/>
-            </w:tcMar>
-          </w:tcPr>
-          <w:p>
-            <w:r>
-              <w:t xml:space="preserve">Adda boşluk/özel karakter var</w:t>
-            </w:r>
-          </w:p>
-        </w:tc>
-        <w:tc>
-          <w:tcPr>
-            <w:tcW w:type="dxa" w:w="3120"/>
-            <w:shd w:fill="FFFFFF" w:val="clear"/>
-            <w:tcMar>
-              <w:top w:type="dxa" w:w="90"/>
-              <w:left w:type="dxa" w:w="120"/>
-              <w:bottom w:type="dxa" w:w="90"/>
-              <w:right w:type="dxa" w:w="120"/>
-            </w:tcMar>
-          </w:tcPr>
-          <w:p>
-            <w:r>
-              <w:t xml:space="preserve">Yalnızca harf, rakam, “-” kullanın</w:t>
-            </w:r>
-          </w:p>
-        </w:tc>
-      </w:tr>
-      <w:tr>
-        <w:tc>
-          <w:tcPr>
-            <w:tcW w:type="dxa" w:w="3120"/>
-            <w:shd w:fill="F7F7F7" w:val="clear"/>
-            <w:tcMar>
-              <w:top w:type="dxa" w:w="90"/>
-              <w:left w:type="dxa" w:w="120"/>
-              <w:bottom w:type="dxa" w:w="90"/>
-              <w:right w:type="dxa" w:w="120"/>
-            </w:tcMar>
-          </w:tcPr>
-          <w:p>
-            <w:r>
-              <w:t xml:space="preserve">Windows'ta 15 karakter sınırı aşılıyor</w:t>
-            </w:r>
-          </w:p>
-        </w:tc>
-        <w:tc>
-          <w:tcPr>
-            <w:tcW w:type="dxa" w:w="3120"/>
-            <w:shd w:fill="F7F7F7" w:val="clear"/>
-            <w:tcMar>
-              <w:top w:type="dxa" w:w="90"/>
-              <w:left w:type="dxa" w:w="120"/>
-              <w:bottom w:type="dxa" w:w="90"/>
-              <w:right w:type="dxa" w:w="120"/>
-            </w:tcMar>
-          </w:tcPr>
-          <w:p>
-            <w:r>
-              <w:t xml:space="preserve">NetBIOS kısıtlaması</w:t>
-            </w:r>
-          </w:p>
-        </w:tc>
-        <w:tc>
-          <w:tcPr>
-            <w:tcW w:type="dxa" w:w="3120"/>
-            <w:shd w:fill="F7F7F7" w:val="clear"/>
-            <w:tcMar>
-              <w:top w:type="dxa" w:w="90"/>
-              <w:left w:type="dxa" w:w="120"/>
-              <w:bottom w:type="dxa" w:w="90"/>
-              <w:right w:type="dxa" w:w="120"/>
-            </w:tcMar>
-          </w:tcPr>
-          <w:p>
-            <w:r>
-              <w:t xml:space="preserve">Adı 15 karakter veya altına indirin</w:t>
-            </w:r>
-          </w:p>
-        </w:tc>
-      </w:tr>
-    </w:tbl>
     <w:sectPr>
       <w:headerReference w:type="default" r:id="rId7"/>
       <w:footerReference w:type="default" r:id="rId8"/>

</xml_diff>